<commit_message>
Update docs with Magic Link confirmation details instead of client portal portal/booking
</commit_message>
<xml_diff>
--- a/Product_Documentation.docx
+++ b/Product_Documentation.docx
@@ -164,7 +164,7 @@
         <w:rPr>
           <w:sz w:val="22"/>
         </w:rPr>
-        <w:t>Клиенты: Пользователи онлайн-записи и получатели уведомлений. Их цель — быстро выбрать удобное время и подтвердить свой визит в 1 клик.</w:t>
+        <w:t>Клиенты: Получатели уведомлений и ссылок. Их цель — быстро ознакомиться с визитом и подтвердить его в 1 клик.</w:t>
       </w:r>
     </w:p>
     <w:p>
@@ -265,7 +265,7 @@
         <w:rPr>
           <w:sz w:val="22"/>
         </w:rPr>
-        <w:t>Личный кабинет клиента: Минималистичная веб-страница, где клиент видит детали своей записи и может нажать «Да, я приду», что мгновенно меняет статус записи в блокноте Айгерим на зеленый.</w:t>
+        <w:t>Магическая ссылка подтверждения: Одноразовая веб-страница, где клиент видит детали своей конкретной записи и может нажать «Да, я приду», что мгновенно меняет статус записи в блокноте Айгерим на зеленый.</w:t>
       </w:r>
     </w:p>
     <w:p>
@@ -303,6 +303,30 @@
           <w:sz w:val="22"/>
         </w:rPr>
         <w:t>Авторизацию по паролям/SMS для Айгерим и клиентов (используется сессионный доступ по прямым ссылкам).</w:t>
+      </w:r>
+    </w:p>
+    <w:p>
+      <w:pPr>
+        <w:pStyle w:val="ListBullet"/>
+        <w:spacing w:after="80"/>
+      </w:pPr>
+      <w:r>
+        <w:rPr>
+          <w:sz w:val="22"/>
+        </w:rPr>
+        <w:t>Модуль онлайн-записи (клиенты не могут записываться самостоятельно на сайте в v1, запись вносит только мастер).</w:t>
+      </w:r>
+    </w:p>
+    <w:p>
+      <w:pPr>
+        <w:pStyle w:val="ListBullet"/>
+        <w:spacing w:after="80"/>
+      </w:pPr>
+      <w:r>
+        <w:rPr>
+          <w:sz w:val="22"/>
+        </w:rPr>
+        <w:t>Личный кабинет клиента со списком прошлых/будущих записей.</w:t>
       </w:r>
     </w:p>
     <w:p>
@@ -473,7 +497,7 @@
         <w:rPr>
           <w:sz w:val="22"/>
         </w:rPr>
-        <w:t>Подтверждение от клиента: Интерактивная кнопка подтверждения в портале клиента с обратной связью в админ-панель.</w:t>
+        <w:t>Подтверждение по Магической ссылке: Интерактивная кнопка подтверждения на странице визита с обратной связью в админ-панель.</w:t>
       </w:r>
     </w:p>
     <w:p>
@@ -534,7 +558,7 @@
         <w:rPr>
           <w:sz w:val="22"/>
         </w:rPr>
-        <w:t>Айгерим нажимает «Напомнить», что генерирует сообщение для отправки клиенту в WhatsApp.</w:t>
+        <w:t>Айгерим нажимает «Напомнить», что генерирует сообщение для отправки клиенту в WhatsApp с индивидуальной ссылкой подтверждения.</w:t>
       </w:r>
     </w:p>
     <w:p>
@@ -546,7 +570,7 @@
         <w:rPr>
           <w:sz w:val="22"/>
         </w:rPr>
-        <w:t>Клиент переходит по ссылке, открывает личный кабинет и подтверждает визит.</w:t>
+        <w:t>Клиент переходит по ссылке, открывает карточку своего визита и подтверждает его.</w:t>
       </w:r>
     </w:p>
     <w:p>
@@ -729,7 +753,7 @@
           </w:tcPr>
           <w:p>
             <w:r>
-              <w:t>Ручная симуляция WhatsApp-шаблона</w:t>
+              <w:t>Ручная симуляция WhatsApp-ссылки с текстом</w:t>
             </w:r>
           </w:p>
         </w:tc>
@@ -761,7 +785,7 @@
           </w:tcPr>
           <w:p>
             <w:r>
-              <w:t>Клиентский портал</w:t>
+              <w:t>Подтверждение визитов</w:t>
             </w:r>
           </w:p>
         </w:tc>
@@ -771,7 +795,7 @@
           </w:tcPr>
           <w:p>
             <w:r>
-              <w:t>Онлайн-запись на свободные окна, подтверждение визита</w:t>
+              <w:t>Магическая ссылка с карточкой встречи и кнопкой подтверждения</w:t>
             </w:r>
           </w:p>
         </w:tc>
@@ -781,7 +805,7 @@
           </w:tcPr>
           <w:p>
             <w:r>
-              <w:t>Личный кабинет со всеми записями</w:t>
+              <w:t>Авто-авторизация без SMS, поддержка смены времени клиентом</w:t>
             </w:r>
           </w:p>
         </w:tc>
@@ -791,7 +815,7 @@
           </w:tcPr>
           <w:p>
             <w:r>
-              <w:t>Программа лояльности (бонусы)</w:t>
+              <w:t>Автоматическое предложение переноса визита при отмене</w:t>
             </w:r>
           </w:p>
         </w:tc>

</xml_diff>